<commit_message>
Add price book import, provisional pricing mode, and non-data product support
- price-book-import skill and script: bring an existing price book into the standard format, classify product types, rank datasets for rights intake
- price-book-builder (renamed from data-price-book-builder): all product types, strategy and release modes, optional register, exposure report
- price corridor: rights are a basis (Confirmed, Provisional, Blocked), not a gate; works for non-data products
- skills, GEMINI.md, commands, subagents and Copilot playbooks updated; new Playbook 11; zips regenerated

Co-Authored-By: Claude Sonnet 5.5 <noreply@anthropic.com>
Claude-Session: https://claude.ai/code/session_01RCWTNYcYUaSjT9EJYKEiiy
</commit_message>
<xml_diff>
--- a/copilot-guide/Copilot-Guide.docx
+++ b/copilot-guide/Copilot-Guide.docx
@@ -120,7 +120,7 @@
         <w:t xml:space="preserve">Copilot proposes rights; Legal confirms them.</w:t>
       </w:r>
       <w:r>
-        <w:t xml:space="preserve"> Silence in a contract means Unknown.</w:t>
+        <w:t xml:space="preserve"> Silence in a contract means Unknown. Copilot can still price an unconfirmed right if it labels the price Provisional. Provisional prices are for strategy and for deciding where Legal time goes, not for quoting.</w:t>
       </w:r>
     </w:p>
     <w:p>
@@ -1812,7 +1812,7 @@
                 <w:sz w:val="20"/>
                 <w:szCs w:val="20"/>
               </w:rPr>
-              <w:t xml:space="preserve">Costs, segments and value sources, comparables, WTP points, eligible rights</w:t>
+              <w:t xml:space="preserve">Costs, segments and value sources, comparables, WTP points, which rights Legal has confirmed</w:t>
             </w:r>
           </w:p>
         </w:tc>
@@ -1840,7 +1840,7 @@
                 <w:sz w:val="20"/>
                 <w:szCs w:val="20"/>
               </w:rPr>
-              <w:t xml:space="preserve">Recompute floor and one value price. Inputs have sources. Unsupported inputs labeled.</w:t>
+              <w:t xml:space="preserve">Recompute floor and one value price. Inputs have sources. Unconfirmed rights labeled Provisional.</w:t>
             </w:r>
           </w:p>
         </w:tc>
@@ -1901,7 +1901,7 @@
                 <w:sz w:val="20"/>
                 <w:szCs w:val="20"/>
               </w:rPr>
-              <w:t xml:space="preserve">Corridor results, eligible rights, past deals</w:t>
+              <w:t xml:space="preserve">Corridor results, register export if any, past deals</w:t>
             </w:r>
           </w:p>
         </w:tc>
@@ -1929,7 +1929,7 @@
                 <w:sz w:val="20"/>
                 <w:szCs w:val="20"/>
               </w:rPr>
-              <w:t xml:space="preserve">Each line tied to an eligible right. Floor not above list. No tier overlaps or cliffs.</w:t>
+              <w:t xml:space="preserve">Each data line has a rights basis. Floor not above list. No tier overlaps or cliffs.</w:t>
             </w:r>
           </w:p>
         </w:tc>
@@ -2018,7 +2018,7 @@
                 <w:sz w:val="20"/>
                 <w:szCs w:val="20"/>
               </w:rPr>
-              <w:t xml:space="preserve">Rights checked before price. Unknown means escalate, not quote.</w:t>
+              <w:t xml:space="preserve">Rights checked. Unknown means a Provisional price and an escalation, never "allowed".</w:t>
             </w:r>
           </w:p>
         </w:tc>
@@ -2553,6 +2553,95 @@
                 <w:szCs w:val="20"/>
               </w:rPr>
               <w:t xml:space="preserve">As-of date stated. No step skipped. Use the resolver for bulk.</w:t>
+            </w:r>
+          </w:p>
+        </w:tc>
+      </w:tr>
+      <w:tr>
+        <w:trPr>
+          <w:cantSplit/>
+        </w:trPr>
+        <w:tc>
+          <w:tcPr>
+            <w:tcW w:type="dxa" w:w="2300"/>
+            <w:tcBorders>
+              <w:top w:val="single" w:color="BFBFBF" w:sz="4"/>
+              <w:left w:val="single" w:color="BFBFBF" w:sz="4"/>
+              <w:bottom w:val="single" w:color="BFBFBF" w:sz="4"/>
+              <w:right w:val="single" w:color="BFBFBF" w:sz="4"/>
+            </w:tcBorders>
+            <w:tcMar>
+              <w:top w:type="dxa" w:w="60"/>
+              <w:left w:type="dxa" w:w="100"/>
+              <w:bottom w:type="dxa" w:w="60"/>
+              <w:right w:type="dxa" w:w="100"/>
+            </w:tcMar>
+          </w:tcPr>
+          <w:p>
+            <w:r>
+              <w:rPr>
+                <w:b w:val="false"/>
+                <w:bCs w:val="false"/>
+                <w:sz w:val="20"/>
+                <w:szCs w:val="20"/>
+              </w:rPr>
+              <w:t xml:space="preserve">11 Import price book</w:t>
+            </w:r>
+          </w:p>
+        </w:tc>
+        <w:tc>
+          <w:tcPr>
+            <w:tcW w:type="dxa" w:w="3000"/>
+            <w:tcBorders>
+              <w:top w:val="single" w:color="BFBFBF" w:sz="4"/>
+              <w:left w:val="single" w:color="BFBFBF" w:sz="4"/>
+              <w:bottom w:val="single" w:color="BFBFBF" w:sz="4"/>
+              <w:right w:val="single" w:color="BFBFBF" w:sz="4"/>
+            </w:tcBorders>
+            <w:tcMar>
+              <w:top w:type="dxa" w:w="60"/>
+              <w:left w:type="dxa" w:w="100"/>
+              <w:bottom w:type="dxa" w:w="60"/>
+              <w:right w:type="dxa" w:w="100"/>
+            </w:tcMar>
+          </w:tcPr>
+          <w:p>
+            <w:r>
+              <w:rPr>
+                <w:b w:val="false"/>
+                <w:bCs w:val="false"/>
+                <w:sz w:val="20"/>
+                <w:szCs w:val="20"/>
+              </w:rPr>
+              <w:t xml:space="preserve">Existing price book (Excel or CSV), revenue per product</w:t>
+            </w:r>
+          </w:p>
+        </w:tc>
+        <w:tc>
+          <w:tcPr>
+            <w:tcW w:type="dxa" w:w="4060"/>
+            <w:tcBorders>
+              <w:top w:val="single" w:color="BFBFBF" w:sz="4"/>
+              <w:left w:val="single" w:color="BFBFBF" w:sz="4"/>
+              <w:bottom w:val="single" w:color="BFBFBF" w:sz="4"/>
+              <w:right w:val="single" w:color="BFBFBF" w:sz="4"/>
+            </w:tcBorders>
+            <w:tcMar>
+              <w:top w:type="dxa" w:w="60"/>
+              <w:left w:type="dxa" w:w="100"/>
+              <w:bottom w:type="dxa" w:w="60"/>
+              <w:right w:type="dxa" w:w="100"/>
+            </w:tcMar>
+          </w:tcPr>
+          <w:p>
+            <w:r>
+              <w:rPr>
+                <w:b w:val="false"/>
+                <w:bCs w:val="false"/>
+                <w:sz w:val="20"/>
+                <w:szCs w:val="20"/>
+              </w:rPr>
+              <w:t xml:space="preserve">Nothing invented. Blanks listed. Product types confirmed. Row counts match the source.</w:t>
             </w:r>
           </w:p>
         </w:tc>

</xml_diff>

<commit_message>
Add price book import, provisional pricing mode, and non-data product support (#4)
- price-book-import skill and script: bring an existing price book into the standard format, classify product types, rank datasets for rights intake
- price-book-builder (renamed from data-price-book-builder): all product types, strategy and release modes, optional register, exposure report
- price corridor: rights are a basis (Confirmed, Provisional, Blocked), not a gate; works for non-data products
- skills, GEMINI.md, commands, subagents and Copilot playbooks updated; new Playbook 11; zips regenerated


Claude-Session: https://claude.ai/code/session_01RCWTNYcYUaSjT9EJYKEiiy

Co-authored-by: Claude <noreply@anthropic.com>
</commit_message>
<xml_diff>
--- a/copilot-guide/Copilot-Guide.docx
+++ b/copilot-guide/Copilot-Guide.docx
@@ -120,7 +120,7 @@
         <w:t xml:space="preserve">Copilot proposes rights; Legal confirms them.</w:t>
       </w:r>
       <w:r>
-        <w:t xml:space="preserve"> Silence in a contract means Unknown.</w:t>
+        <w:t xml:space="preserve"> Silence in a contract means Unknown. Copilot can still price an unconfirmed right if it labels the price Provisional. Provisional prices are for strategy and for deciding where Legal time goes, not for quoting.</w:t>
       </w:r>
     </w:p>
     <w:p>
@@ -1812,7 +1812,7 @@
                 <w:sz w:val="20"/>
                 <w:szCs w:val="20"/>
               </w:rPr>
-              <w:t xml:space="preserve">Costs, segments and value sources, comparables, WTP points, eligible rights</w:t>
+              <w:t xml:space="preserve">Costs, segments and value sources, comparables, WTP points, which rights Legal has confirmed</w:t>
             </w:r>
           </w:p>
         </w:tc>
@@ -1840,7 +1840,7 @@
                 <w:sz w:val="20"/>
                 <w:szCs w:val="20"/>
               </w:rPr>
-              <w:t xml:space="preserve">Recompute floor and one value price. Inputs have sources. Unsupported inputs labeled.</w:t>
+              <w:t xml:space="preserve">Recompute floor and one value price. Inputs have sources. Unconfirmed rights labeled Provisional.</w:t>
             </w:r>
           </w:p>
         </w:tc>
@@ -1901,7 +1901,7 @@
                 <w:sz w:val="20"/>
                 <w:szCs w:val="20"/>
               </w:rPr>
-              <w:t xml:space="preserve">Corridor results, eligible rights, past deals</w:t>
+              <w:t xml:space="preserve">Corridor results, register export if any, past deals</w:t>
             </w:r>
           </w:p>
         </w:tc>
@@ -1929,7 +1929,7 @@
                 <w:sz w:val="20"/>
                 <w:szCs w:val="20"/>
               </w:rPr>
-              <w:t xml:space="preserve">Each line tied to an eligible right. Floor not above list. No tier overlaps or cliffs.</w:t>
+              <w:t xml:space="preserve">Each data line has a rights basis. Floor not above list. No tier overlaps or cliffs.</w:t>
             </w:r>
           </w:p>
         </w:tc>
@@ -2018,7 +2018,7 @@
                 <w:sz w:val="20"/>
                 <w:szCs w:val="20"/>
               </w:rPr>
-              <w:t xml:space="preserve">Rights checked before price. Unknown means escalate, not quote.</w:t>
+              <w:t xml:space="preserve">Rights checked. Unknown means a Provisional price and an escalation, never "allowed".</w:t>
             </w:r>
           </w:p>
         </w:tc>
@@ -2553,6 +2553,95 @@
                 <w:szCs w:val="20"/>
               </w:rPr>
               <w:t xml:space="preserve">As-of date stated. No step skipped. Use the resolver for bulk.</w:t>
+            </w:r>
+          </w:p>
+        </w:tc>
+      </w:tr>
+      <w:tr>
+        <w:trPr>
+          <w:cantSplit/>
+        </w:trPr>
+        <w:tc>
+          <w:tcPr>
+            <w:tcW w:type="dxa" w:w="2300"/>
+            <w:tcBorders>
+              <w:top w:val="single" w:color="BFBFBF" w:sz="4"/>
+              <w:left w:val="single" w:color="BFBFBF" w:sz="4"/>
+              <w:bottom w:val="single" w:color="BFBFBF" w:sz="4"/>
+              <w:right w:val="single" w:color="BFBFBF" w:sz="4"/>
+            </w:tcBorders>
+            <w:tcMar>
+              <w:top w:type="dxa" w:w="60"/>
+              <w:left w:type="dxa" w:w="100"/>
+              <w:bottom w:type="dxa" w:w="60"/>
+              <w:right w:type="dxa" w:w="100"/>
+            </w:tcMar>
+          </w:tcPr>
+          <w:p>
+            <w:r>
+              <w:rPr>
+                <w:b w:val="false"/>
+                <w:bCs w:val="false"/>
+                <w:sz w:val="20"/>
+                <w:szCs w:val="20"/>
+              </w:rPr>
+              <w:t xml:space="preserve">11 Import price book</w:t>
+            </w:r>
+          </w:p>
+        </w:tc>
+        <w:tc>
+          <w:tcPr>
+            <w:tcW w:type="dxa" w:w="3000"/>
+            <w:tcBorders>
+              <w:top w:val="single" w:color="BFBFBF" w:sz="4"/>
+              <w:left w:val="single" w:color="BFBFBF" w:sz="4"/>
+              <w:bottom w:val="single" w:color="BFBFBF" w:sz="4"/>
+              <w:right w:val="single" w:color="BFBFBF" w:sz="4"/>
+            </w:tcBorders>
+            <w:tcMar>
+              <w:top w:type="dxa" w:w="60"/>
+              <w:left w:type="dxa" w:w="100"/>
+              <w:bottom w:type="dxa" w:w="60"/>
+              <w:right w:type="dxa" w:w="100"/>
+            </w:tcMar>
+          </w:tcPr>
+          <w:p>
+            <w:r>
+              <w:rPr>
+                <w:b w:val="false"/>
+                <w:bCs w:val="false"/>
+                <w:sz w:val="20"/>
+                <w:szCs w:val="20"/>
+              </w:rPr>
+              <w:t xml:space="preserve">Existing price book (Excel or CSV), revenue per product</w:t>
+            </w:r>
+          </w:p>
+        </w:tc>
+        <w:tc>
+          <w:tcPr>
+            <w:tcW w:type="dxa" w:w="4060"/>
+            <w:tcBorders>
+              <w:top w:val="single" w:color="BFBFBF" w:sz="4"/>
+              <w:left w:val="single" w:color="BFBFBF" w:sz="4"/>
+              <w:bottom w:val="single" w:color="BFBFBF" w:sz="4"/>
+              <w:right w:val="single" w:color="BFBFBF" w:sz="4"/>
+            </w:tcBorders>
+            <w:tcMar>
+              <w:top w:type="dxa" w:w="60"/>
+              <w:left w:type="dxa" w:w="100"/>
+              <w:bottom w:type="dxa" w:w="60"/>
+              <w:right w:type="dxa" w:w="100"/>
+            </w:tcMar>
+          </w:tcPr>
+          <w:p>
+            <w:r>
+              <w:rPr>
+                <w:b w:val="false"/>
+                <w:bCs w:val="false"/>
+                <w:sz w:val="20"/>
+                <w:szCs w:val="20"/>
+              </w:rPr>
+              <w:t xml:space="preserve">Nothing invented. Blanks listed. Product types confirmed. Row counts match the source.</w:t>
             </w:r>
           </w:p>
         </w:tc>

</xml_diff>